<commit_message>
Insert Table 1 with a full-text evidence record
Table 1 is built from full-text reading of five studies rather than from
reported headline figures, and every cell is documented in
TABLE_1_EVIDENCE.md with the section it came from and, for negative cells,
the sections searched.

Four corrections are carried with footnotes: Disci et al.'s 98.73% is a
sample-weighted average over train and test (support 7,023) and the test
accuracy is 95.27%; Shah et al.'s 98.87% is binary and on the validation
split; Reyes and Sanchez ran five seeds but report only the maximum. A sixth
study is omitted because its figures are numerically identical to another on
the same dataset and pipeline.

The repeated-training-runs column is negative for every prior study.
</commit_message>
<xml_diff>
--- a/reports/Gonzalves_BrainMRI_Reliability_Paper_final.docx
+++ b/reports/Gonzalves_BrainMRI_Reliability_Paper_final.docx
@@ -286,27 +286,1195 @@
         <w:t xml:space="preserve">Accordingly, the novelty of the present study lies in the task-specific integration of leakage-aware preparation, contamination auditing, multi-metric calibration, paired shifted-domain probing, and repeated-run estimation within a single reproducible framework for brain MRI tumour classification. The contribution is not the isolated introduction of any one of these methods. Instead, they are combined and applied so that the reliability of the standard evaluation protocol can itself be measured. A summary of related approaches, their principal findings, limitations, and the gaps addressed here is presented in Table 1.</w:t>
       </w:r>
     </w:p>
-    <w:p>
-      <w:pPr>
-        <w:pBdr>
-          <w:top w:val="single" w:color="999999" w:sz="6"/>
-          <w:bottom w:val="single" w:color="999999" w:sz="6"/>
-          <w:left w:val="single" w:color="999999" w:sz="6"/>
-          <w:right w:val="single" w:color="999999" w:sz="6"/>
-        </w:pBdr>
-        <w:spacing w:after="160" w:before="160"/>
+    <w:tbl>
+      <w:tblPr>
+        <w:tblW w:type="auto" w:w="0"/>
         <w:jc w:val="center"/>
-      </w:pPr>
-      <w:r>
-        <w:rPr>
-          <w:rFonts w:ascii="Times New Roman" w:cs="Times New Roman" w:eastAsia="Times New Roman" w:hAnsi="Times New Roman"/>
-          <w:b/>
-          <w:bCs/>
-          <w:color w:val="666666"/>
-          <w:sz w:val="20"/>
-          <w:szCs w:val="20"/>
-        </w:rPr>
-        <w:t xml:space="preserve">INSERT TABLE 1 — Summary of related works on brain MRI tumour classification and evaluation reliability</w:t>
+        <w:tblLayout w:type="autofit"/>
+        <w:tblLook w:firstColumn="1" w:firstRow="1" w:lastColumn="0" w:lastRow="0" w:noHBand="0" w:noVBand="1" w:val="04A0"/>
+        <w:tblBorders>
+          <w:top w:val="single" w:sz="4" w:space="0" w:color="666666"/>
+          <w:left w:val="single" w:sz="4" w:space="0" w:color="666666"/>
+          <w:bottom w:val="single" w:sz="4" w:space="0" w:color="666666"/>
+          <w:right w:val="single" w:sz="4" w:space="0" w:color="666666"/>
+          <w:insideH w:val="single" w:sz="4" w:space="0" w:color="666666"/>
+          <w:insideV w:val="single" w:sz="4" w:space="0" w:color="666666"/>
+        </w:tblBorders>
+      </w:tblPr>
+      <w:tblGrid>
+        <w:gridCol w:w="1128"/>
+        <w:gridCol w:w="1128"/>
+        <w:gridCol w:w="1128"/>
+        <w:gridCol w:w="1128"/>
+        <w:gridCol w:w="1128"/>
+        <w:gridCol w:w="1128"/>
+        <w:gridCol w:w="1128"/>
+        <w:gridCol w:w="1128"/>
+      </w:tblGrid>
+      <w:tr>
+        <w:tc>
+          <w:tcPr>
+            <w:tcW w:type="dxa" w:w="1106"/>
+            <w:shd w:val="clear" w:fill="E8E8E8"/>
+          </w:tcPr>
+          <w:p>
+            <w:pPr>
+              <w:spacing w:after="0" w:before="0"/>
+              <w:jc w:val="center"/>
+            </w:pPr>
+            <w:r/>
+            <w:r>
+              <w:rPr>
+                <w:rFonts w:ascii="Times New Roman" w:hAnsi="Times New Roman"/>
+                <w:b/>
+                <w:sz w:val="16"/>
+              </w:rPr>
+              <w:t>Study</w:t>
+            </w:r>
+          </w:p>
+        </w:tc>
+        <w:tc>
+          <w:tcPr>
+            <w:tcW w:type="dxa" w:w="1447"/>
+            <w:shd w:val="clear" w:fill="E8E8E8"/>
+          </w:tcPr>
+          <w:p>
+            <w:pPr>
+              <w:spacing w:after="0" w:before="0"/>
+              <w:jc w:val="center"/>
+            </w:pPr>
+            <w:r/>
+            <w:r>
+              <w:rPr>
+                <w:rFonts w:ascii="Times New Roman" w:hAnsi="Times New Roman"/>
+                <w:b/>
+                <w:sz w:val="16"/>
+              </w:rPr>
+              <w:t>Task and dataset</w:t>
+            </w:r>
+          </w:p>
+        </w:tc>
+        <w:tc>
+          <w:tcPr>
+            <w:tcW w:type="dxa" w:w="1191"/>
+            <w:shd w:val="clear" w:fill="E8E8E8"/>
+          </w:tcPr>
+          <w:p>
+            <w:pPr>
+              <w:spacing w:after="0" w:before="0"/>
+              <w:jc w:val="center"/>
+            </w:pPr>
+            <w:r/>
+            <w:r>
+              <w:rPr>
+                <w:rFonts w:ascii="Times New Roman" w:hAnsi="Times New Roman"/>
+                <w:b/>
+                <w:sz w:val="16"/>
+              </w:rPr>
+              <w:t>Best internal result</w:t>
+            </w:r>
+          </w:p>
+        </w:tc>
+        <w:tc>
+          <w:tcPr>
+            <w:tcW w:type="dxa" w:w="1106"/>
+            <w:shd w:val="clear" w:fill="E8E8E8"/>
+          </w:tcPr>
+          <w:p>
+            <w:pPr>
+              <w:spacing w:after="0" w:before="0"/>
+              <w:jc w:val="center"/>
+            </w:pPr>
+            <w:r/>
+            <w:r>
+              <w:rPr>
+                <w:rFonts w:ascii="Times New Roman" w:hAnsi="Times New Roman"/>
+                <w:b/>
+                <w:sz w:val="16"/>
+              </w:rPr>
+              <w:t>Split</w:t>
+            </w:r>
+          </w:p>
+        </w:tc>
+        <w:tc>
+          <w:tcPr>
+            <w:tcW w:type="dxa" w:w="1021"/>
+            <w:shd w:val="clear" w:fill="E8E8E8"/>
+          </w:tcPr>
+          <w:p>
+            <w:pPr>
+              <w:spacing w:after="0" w:before="0"/>
+              <w:jc w:val="center"/>
+            </w:pPr>
+            <w:r/>
+            <w:r>
+              <w:rPr>
+                <w:rFonts w:ascii="Times New Roman" w:hAnsi="Times New Roman"/>
+                <w:b/>
+                <w:sz w:val="16"/>
+              </w:rPr>
+              <w:t>Calibration</w:t>
+            </w:r>
+          </w:p>
+        </w:tc>
+        <w:tc>
+          <w:tcPr>
+            <w:tcW w:type="dxa" w:w="1191"/>
+            <w:shd w:val="clear" w:fill="E8E8E8"/>
+          </w:tcPr>
+          <w:p>
+            <w:pPr>
+              <w:spacing w:after="0" w:before="0"/>
+              <w:jc w:val="center"/>
+            </w:pPr>
+            <w:r/>
+            <w:r>
+              <w:rPr>
+                <w:rFonts w:ascii="Times New Roman" w:hAnsi="Times New Roman"/>
+                <w:b/>
+                <w:sz w:val="16"/>
+              </w:rPr>
+              <w:t>Leakage or overlap audit</w:t>
+            </w:r>
+          </w:p>
+        </w:tc>
+        <w:tc>
+          <w:tcPr>
+            <w:tcW w:type="dxa" w:w="1276"/>
+            <w:shd w:val="clear" w:fill="E8E8E8"/>
+          </w:tcPr>
+          <w:p>
+            <w:pPr>
+              <w:spacing w:after="0" w:before="0"/>
+              <w:jc w:val="center"/>
+            </w:pPr>
+            <w:r/>
+            <w:r>
+              <w:rPr>
+                <w:rFonts w:ascii="Times New Roman" w:hAnsi="Times New Roman"/>
+                <w:b/>
+                <w:sz w:val="16"/>
+              </w:rPr>
+              <w:t>External or shifted-domain validation</w:t>
+            </w:r>
+          </w:p>
+        </w:tc>
+        <w:tc>
+          <w:tcPr>
+            <w:tcW w:type="dxa" w:w="1021"/>
+            <w:shd w:val="clear" w:fill="E8E8E8"/>
+          </w:tcPr>
+          <w:p>
+            <w:pPr>
+              <w:spacing w:after="0" w:before="0"/>
+              <w:jc w:val="center"/>
+            </w:pPr>
+            <w:r/>
+            <w:r>
+              <w:rPr>
+                <w:rFonts w:ascii="Times New Roman" w:hAnsi="Times New Roman"/>
+                <w:b/>
+                <w:sz w:val="16"/>
+              </w:rPr>
+              <w:t>Repeated training runs</w:t>
+            </w:r>
+          </w:p>
+        </w:tc>
+      </w:tr>
+      <w:tr>
+        <w:tc>
+          <w:tcPr>
+            <w:tcW w:type="dxa" w:w="1106"/>
+          </w:tcPr>
+          <w:p>
+            <w:pPr>
+              <w:spacing w:after="0" w:before="0"/>
+              <w:jc w:val="left"/>
+            </w:pPr>
+            <w:r/>
+            <w:r>
+              <w:rPr>
+                <w:rFonts w:ascii="Times New Roman" w:hAnsi="Times New Roman"/>
+                <w:b w:val="0"/>
+                <w:sz w:val="16"/>
+              </w:rPr>
+              <w:t>Shah et al. (2022) [6]</w:t>
+            </w:r>
+          </w:p>
+        </w:tc>
+        <w:tc>
+          <w:tcPr>
+            <w:tcW w:type="dxa" w:w="1447"/>
+          </w:tcPr>
+          <w:p>
+            <w:pPr>
+              <w:spacing w:after="0" w:before="0"/>
+              <w:jc w:val="left"/>
+            </w:pPr>
+            <w:r/>
+            <w:r>
+              <w:rPr>
+                <w:rFonts w:ascii="Times New Roman" w:hAnsi="Times New Roman"/>
+                <w:b w:val="0"/>
+                <w:sz w:val="16"/>
+              </w:rPr>
+              <w:t>Binary tumour / non-tumour; Kaggle collection described as a BraTS-derived subset</w:t>
+            </w:r>
+          </w:p>
+        </w:tc>
+        <w:tc>
+          <w:tcPr>
+            <w:tcW w:type="dxa" w:w="1191"/>
+          </w:tcPr>
+          <w:p>
+            <w:pPr>
+              <w:spacing w:after="0" w:before="0"/>
+              <w:jc w:val="left"/>
+            </w:pPr>
+            <w:r/>
+            <w:r>
+              <w:rPr>
+                <w:rFonts w:ascii="Times New Roman" w:hAnsi="Times New Roman"/>
+                <w:b w:val="0"/>
+                <w:sz w:val="16"/>
+              </w:rPr>
+              <w:t>98.87% validation accuracy ᵃ</w:t>
+            </w:r>
+          </w:p>
+        </w:tc>
+        <w:tc>
+          <w:tcPr>
+            <w:tcW w:type="dxa" w:w="1106"/>
+          </w:tcPr>
+          <w:p>
+            <w:pPr>
+              <w:spacing w:after="0" w:before="0"/>
+              <w:jc w:val="left"/>
+            </w:pPr>
+            <w:r/>
+            <w:r>
+              <w:rPr>
+                <w:rFonts w:ascii="Times New Roman" w:hAnsi="Times New Roman"/>
+                <w:b w:val="0"/>
+                <w:sz w:val="16"/>
+              </w:rPr>
+              <w:t>Custom 80/20 plus 60 held-out images</w:t>
+            </w:r>
+          </w:p>
+        </w:tc>
+        <w:tc>
+          <w:tcPr>
+            <w:tcW w:type="dxa" w:w="1021"/>
+          </w:tcPr>
+          <w:p>
+            <w:pPr>
+              <w:spacing w:after="0" w:before="0"/>
+              <w:jc w:val="left"/>
+            </w:pPr>
+            <w:r/>
+            <w:r>
+              <w:rPr>
+                <w:rFonts w:ascii="Times New Roman" w:hAnsi="Times New Roman"/>
+                <w:b w:val="0"/>
+                <w:sz w:val="16"/>
+              </w:rPr>
+              <w:t>No</w:t>
+            </w:r>
+          </w:p>
+        </w:tc>
+        <w:tc>
+          <w:tcPr>
+            <w:tcW w:type="dxa" w:w="1191"/>
+          </w:tcPr>
+          <w:p>
+            <w:pPr>
+              <w:spacing w:after="0" w:before="0"/>
+              <w:jc w:val="left"/>
+            </w:pPr>
+            <w:r/>
+            <w:r>
+              <w:rPr>
+                <w:rFonts w:ascii="Times New Roman" w:hAnsi="Times New Roman"/>
+                <w:b w:val="0"/>
+                <w:sz w:val="16"/>
+              </w:rPr>
+              <w:t>No</w:t>
+            </w:r>
+          </w:p>
+        </w:tc>
+        <w:tc>
+          <w:tcPr>
+            <w:tcW w:type="dxa" w:w="1276"/>
+          </w:tcPr>
+          <w:p>
+            <w:pPr>
+              <w:spacing w:after="0" w:before="0"/>
+              <w:jc w:val="left"/>
+            </w:pPr>
+            <w:r/>
+            <w:r>
+              <w:rPr>
+                <w:rFonts w:ascii="Times New Roman" w:hAnsi="Times New Roman"/>
+                <w:b w:val="0"/>
+                <w:sz w:val="16"/>
+              </w:rPr>
+              <w:t>No</w:t>
+            </w:r>
+          </w:p>
+        </w:tc>
+        <w:tc>
+          <w:tcPr>
+            <w:tcW w:type="dxa" w:w="1021"/>
+          </w:tcPr>
+          <w:p>
+            <w:pPr>
+              <w:spacing w:after="0" w:before="0"/>
+              <w:jc w:val="left"/>
+            </w:pPr>
+            <w:r/>
+            <w:r>
+              <w:rPr>
+                <w:rFonts w:ascii="Times New Roman" w:hAnsi="Times New Roman"/>
+                <w:b w:val="0"/>
+                <w:sz w:val="16"/>
+              </w:rPr>
+              <w:t>No</w:t>
+            </w:r>
+          </w:p>
+        </w:tc>
+      </w:tr>
+      <w:tr>
+        <w:tc>
+          <w:tcPr>
+            <w:tcW w:type="dxa" w:w="1106"/>
+          </w:tcPr>
+          <w:p>
+            <w:pPr>
+              <w:spacing w:after="0" w:before="0"/>
+              <w:jc w:val="left"/>
+            </w:pPr>
+            <w:r/>
+            <w:r>
+              <w:rPr>
+                <w:rFonts w:ascii="Times New Roman" w:hAnsi="Times New Roman"/>
+                <w:b w:val="0"/>
+                <w:sz w:val="16"/>
+              </w:rPr>
+              <w:t>Zulfiqar et al. (2023) [7]</w:t>
+            </w:r>
+          </w:p>
+        </w:tc>
+        <w:tc>
+          <w:tcPr>
+            <w:tcW w:type="dxa" w:w="1447"/>
+          </w:tcPr>
+          <w:p>
+            <w:pPr>
+              <w:spacing w:after="0" w:before="0"/>
+              <w:jc w:val="left"/>
+            </w:pPr>
+            <w:r/>
+            <w:r>
+              <w:rPr>
+                <w:rFonts w:ascii="Times New Roman" w:hAnsi="Times New Roman"/>
+                <w:b w:val="0"/>
+                <w:sz w:val="16"/>
+              </w:rPr>
+              <w:t>Three-class; Figshare CE-MRI (3,064 slices, 233 patients)</w:t>
+            </w:r>
+          </w:p>
+        </w:tc>
+        <w:tc>
+          <w:tcPr>
+            <w:tcW w:type="dxa" w:w="1191"/>
+          </w:tcPr>
+          <w:p>
+            <w:pPr>
+              <w:spacing w:after="0" w:before="0"/>
+              <w:jc w:val="left"/>
+            </w:pPr>
+            <w:r/>
+            <w:r>
+              <w:rPr>
+                <w:rFonts w:ascii="Times New Roman" w:hAnsi="Times New Roman"/>
+                <w:b w:val="0"/>
+                <w:sz w:val="16"/>
+              </w:rPr>
+              <w:t>98.86% test accuracy; mean F1 98.71%</w:t>
+            </w:r>
+          </w:p>
+        </w:tc>
+        <w:tc>
+          <w:tcPr>
+            <w:tcW w:type="dxa" w:w="1106"/>
+          </w:tcPr>
+          <w:p>
+            <w:pPr>
+              <w:spacing w:after="0" w:before="0"/>
+              <w:jc w:val="left"/>
+            </w:pPr>
+            <w:r/>
+            <w:r>
+              <w:rPr>
+                <w:rFonts w:ascii="Times New Roman" w:hAnsi="Times New Roman"/>
+                <w:b w:val="0"/>
+                <w:sz w:val="16"/>
+              </w:rPr>
+              <w:t>Custom 80/20, slice level</w:t>
+            </w:r>
+          </w:p>
+        </w:tc>
+        <w:tc>
+          <w:tcPr>
+            <w:tcW w:type="dxa" w:w="1021"/>
+          </w:tcPr>
+          <w:p>
+            <w:pPr>
+              <w:spacing w:after="0" w:before="0"/>
+              <w:jc w:val="left"/>
+            </w:pPr>
+            <w:r/>
+            <w:r>
+              <w:rPr>
+                <w:rFonts w:ascii="Times New Roman" w:hAnsi="Times New Roman"/>
+                <w:b w:val="0"/>
+                <w:sz w:val="16"/>
+              </w:rPr>
+              <w:t>No</w:t>
+            </w:r>
+          </w:p>
+        </w:tc>
+        <w:tc>
+          <w:tcPr>
+            <w:tcW w:type="dxa" w:w="1191"/>
+          </w:tcPr>
+          <w:p>
+            <w:pPr>
+              <w:spacing w:after="0" w:before="0"/>
+              <w:jc w:val="left"/>
+            </w:pPr>
+            <w:r/>
+            <w:r>
+              <w:rPr>
+                <w:rFonts w:ascii="Times New Roman" w:hAnsi="Times New Roman"/>
+                <w:b w:val="0"/>
+                <w:sz w:val="16"/>
+              </w:rPr>
+              <w:t>No ᵇ</w:t>
+            </w:r>
+          </w:p>
+        </w:tc>
+        <w:tc>
+          <w:tcPr>
+            <w:tcW w:type="dxa" w:w="1276"/>
+          </w:tcPr>
+          <w:p>
+            <w:pPr>
+              <w:spacing w:after="0" w:before="0"/>
+              <w:jc w:val="left"/>
+            </w:pPr>
+            <w:r/>
+            <w:r>
+              <w:rPr>
+                <w:rFonts w:ascii="Times New Roman" w:hAnsi="Times New Roman"/>
+                <w:b w:val="0"/>
+                <w:sz w:val="16"/>
+              </w:rPr>
+              <w:t>Yes, but the target set shares an upstream source ᶜ</w:t>
+            </w:r>
+          </w:p>
+        </w:tc>
+        <w:tc>
+          <w:tcPr>
+            <w:tcW w:type="dxa" w:w="1021"/>
+          </w:tcPr>
+          <w:p>
+            <w:pPr>
+              <w:spacing w:after="0" w:before="0"/>
+              <w:jc w:val="left"/>
+            </w:pPr>
+            <w:r/>
+            <w:r>
+              <w:rPr>
+                <w:rFonts w:ascii="Times New Roman" w:hAnsi="Times New Roman"/>
+                <w:b w:val="0"/>
+                <w:sz w:val="16"/>
+              </w:rPr>
+              <w:t>No</w:t>
+            </w:r>
+          </w:p>
+        </w:tc>
+      </w:tr>
+      <w:tr>
+        <w:tc>
+          <w:tcPr>
+            <w:tcW w:type="dxa" w:w="1106"/>
+          </w:tcPr>
+          <w:p>
+            <w:pPr>
+              <w:spacing w:after="0" w:before="0"/>
+              <w:jc w:val="left"/>
+            </w:pPr>
+            <w:r/>
+            <w:r>
+              <w:rPr>
+                <w:rFonts w:ascii="Times New Roman" w:hAnsi="Times New Roman"/>
+                <w:b w:val="0"/>
+                <w:sz w:val="16"/>
+              </w:rPr>
+              <w:t>Reyes and Sánchez (2024) [30]</w:t>
+            </w:r>
+          </w:p>
+        </w:tc>
+        <w:tc>
+          <w:tcPr>
+            <w:tcW w:type="dxa" w:w="1447"/>
+          </w:tcPr>
+          <w:p>
+            <w:pPr>
+              <w:spacing w:after="0" w:before="0"/>
+              <w:jc w:val="left"/>
+            </w:pPr>
+            <w:r/>
+            <w:r>
+              <w:rPr>
+                <w:rFonts w:ascii="Times New Roman" w:hAnsi="Times New Roman"/>
+                <w:b w:val="0"/>
+                <w:sz w:val="16"/>
+              </w:rPr>
+              <w:t>Three-class and four-class; Figshare CE-MRI and a Kaggle collection</w:t>
+            </w:r>
+          </w:p>
+        </w:tc>
+        <w:tc>
+          <w:tcPr>
+            <w:tcW w:type="dxa" w:w="1191"/>
+          </w:tcPr>
+          <w:p>
+            <w:pPr>
+              <w:spacing w:after="0" w:before="0"/>
+              <w:jc w:val="left"/>
+            </w:pPr>
+            <w:r/>
+            <w:r>
+              <w:rPr>
+                <w:rFonts w:ascii="Times New Roman" w:hAnsi="Times New Roman"/>
+                <w:b w:val="0"/>
+                <w:sz w:val="16"/>
+              </w:rPr>
+              <w:t>98.7% test accuracy</w:t>
+            </w:r>
+          </w:p>
+        </w:tc>
+        <w:tc>
+          <w:tcPr>
+            <w:tcW w:type="dxa" w:w="1106"/>
+          </w:tcPr>
+          <w:p>
+            <w:pPr>
+              <w:spacing w:after="0" w:before="0"/>
+              <w:jc w:val="left"/>
+            </w:pPr>
+            <w:r/>
+            <w:r>
+              <w:rPr>
+                <w:rFonts w:ascii="Times New Roman" w:hAnsi="Times New Roman"/>
+                <w:b w:val="0"/>
+                <w:sz w:val="16"/>
+              </w:rPr>
+              <w:t>Custom 80/10/10 on each dataset</w:t>
+            </w:r>
+          </w:p>
+        </w:tc>
+        <w:tc>
+          <w:tcPr>
+            <w:tcW w:type="dxa" w:w="1021"/>
+          </w:tcPr>
+          <w:p>
+            <w:pPr>
+              <w:spacing w:after="0" w:before="0"/>
+              <w:jc w:val="left"/>
+            </w:pPr>
+            <w:r/>
+            <w:r>
+              <w:rPr>
+                <w:rFonts w:ascii="Times New Roman" w:hAnsi="Times New Roman"/>
+                <w:b w:val="0"/>
+                <w:sz w:val="16"/>
+              </w:rPr>
+              <w:t>No</w:t>
+            </w:r>
+          </w:p>
+        </w:tc>
+        <w:tc>
+          <w:tcPr>
+            <w:tcW w:type="dxa" w:w="1191"/>
+          </w:tcPr>
+          <w:p>
+            <w:pPr>
+              <w:spacing w:after="0" w:before="0"/>
+              <w:jc w:val="left"/>
+            </w:pPr>
+            <w:r/>
+            <w:r>
+              <w:rPr>
+                <w:rFonts w:ascii="Times New Roman" w:hAnsi="Times New Roman"/>
+                <w:b w:val="0"/>
+                <w:sz w:val="16"/>
+              </w:rPr>
+              <w:t>Partly: cross-dataset overlap quantified; no patient-level split ᵈ</w:t>
+            </w:r>
+          </w:p>
+        </w:tc>
+        <w:tc>
+          <w:tcPr>
+            <w:tcW w:type="dxa" w:w="1276"/>
+          </w:tcPr>
+          <w:p>
+            <w:pPr>
+              <w:spacing w:after="0" w:before="0"/>
+              <w:jc w:val="left"/>
+            </w:pPr>
+            <w:r/>
+            <w:r>
+              <w:rPr>
+                <w:rFonts w:ascii="Times New Roman" w:hAnsi="Times New Roman"/>
+                <w:b w:val="0"/>
+                <w:sz w:val="16"/>
+              </w:rPr>
+              <w:t>No: each dataset trained and tested within itself</w:t>
+            </w:r>
+          </w:p>
+        </w:tc>
+        <w:tc>
+          <w:tcPr>
+            <w:tcW w:type="dxa" w:w="1021"/>
+          </w:tcPr>
+          <w:p>
+            <w:pPr>
+              <w:spacing w:after="0" w:before="0"/>
+              <w:jc w:val="left"/>
+            </w:pPr>
+            <w:r/>
+            <w:r>
+              <w:rPr>
+                <w:rFonts w:ascii="Times New Roman" w:hAnsi="Times New Roman"/>
+                <w:b w:val="0"/>
+                <w:sz w:val="16"/>
+              </w:rPr>
+              <w:t>Yes, five seeds, but only the maximum reported ᵉ</w:t>
+            </w:r>
+          </w:p>
+        </w:tc>
+      </w:tr>
+      <w:tr>
+        <w:tc>
+          <w:tcPr>
+            <w:tcW w:type="dxa" w:w="1106"/>
+          </w:tcPr>
+          <w:p>
+            <w:pPr>
+              <w:spacing w:after="0" w:before="0"/>
+              <w:jc w:val="left"/>
+            </w:pPr>
+            <w:r/>
+            <w:r>
+              <w:rPr>
+                <w:rFonts w:ascii="Times New Roman" w:hAnsi="Times New Roman"/>
+                <w:b w:val="0"/>
+                <w:sz w:val="16"/>
+              </w:rPr>
+              <w:t>Disci et al. (2025) [5]</w:t>
+            </w:r>
+          </w:p>
+        </w:tc>
+        <w:tc>
+          <w:tcPr>
+            <w:tcW w:type="dxa" w:w="1447"/>
+          </w:tcPr>
+          <w:p>
+            <w:pPr>
+              <w:spacing w:after="0" w:before="0"/>
+              <w:jc w:val="left"/>
+            </w:pPr>
+            <w:r/>
+            <w:r>
+              <w:rPr>
+                <w:rFonts w:ascii="Times New Roman" w:hAnsi="Times New Roman"/>
+                <w:b w:val="0"/>
+                <w:sz w:val="16"/>
+              </w:rPr>
+              <w:t>Four-class; aggregated Kaggle collection (7,023 images)</w:t>
+            </w:r>
+          </w:p>
+        </w:tc>
+        <w:tc>
+          <w:tcPr>
+            <w:tcW w:type="dxa" w:w="1191"/>
+          </w:tcPr>
+          <w:p>
+            <w:pPr>
+              <w:spacing w:after="0" w:before="0"/>
+              <w:jc w:val="left"/>
+            </w:pPr>
+            <w:r/>
+            <w:r>
+              <w:rPr>
+                <w:rFonts w:ascii="Times New Roman" w:hAnsi="Times New Roman"/>
+                <w:b w:val="0"/>
+                <w:sz w:val="16"/>
+              </w:rPr>
+              <w:t>95.27% test accuracy; macro-F1 0.9491 ᶠ</w:t>
+            </w:r>
+          </w:p>
+        </w:tc>
+        <w:tc>
+          <w:tcPr>
+            <w:tcW w:type="dxa" w:w="1106"/>
+          </w:tcPr>
+          <w:p>
+            <w:pPr>
+              <w:spacing w:after="0" w:before="0"/>
+              <w:jc w:val="left"/>
+            </w:pPr>
+            <w:r/>
+            <w:r>
+              <w:rPr>
+                <w:rFonts w:ascii="Times New Roman" w:hAnsi="Times New Roman"/>
+                <w:b w:val="0"/>
+                <w:sz w:val="16"/>
+              </w:rPr>
+              <w:t>Distributed split as published</w:t>
+            </w:r>
+          </w:p>
+        </w:tc>
+        <w:tc>
+          <w:tcPr>
+            <w:tcW w:type="dxa" w:w="1021"/>
+          </w:tcPr>
+          <w:p>
+            <w:pPr>
+              <w:spacing w:after="0" w:before="0"/>
+              <w:jc w:val="left"/>
+            </w:pPr>
+            <w:r/>
+            <w:r>
+              <w:rPr>
+                <w:rFonts w:ascii="Times New Roman" w:hAnsi="Times New Roman"/>
+                <w:b w:val="0"/>
+                <w:sz w:val="16"/>
+              </w:rPr>
+              <w:t>No</w:t>
+            </w:r>
+          </w:p>
+        </w:tc>
+        <w:tc>
+          <w:tcPr>
+            <w:tcW w:type="dxa" w:w="1191"/>
+          </w:tcPr>
+          <w:p>
+            <w:pPr>
+              <w:spacing w:after="0" w:before="0"/>
+              <w:jc w:val="left"/>
+            </w:pPr>
+            <w:r/>
+            <w:r>
+              <w:rPr>
+                <w:rFonts w:ascii="Times New Roman" w:hAnsi="Times New Roman"/>
+                <w:b w:val="0"/>
+                <w:sz w:val="16"/>
+              </w:rPr>
+              <w:t>No</w:t>
+            </w:r>
+          </w:p>
+        </w:tc>
+        <w:tc>
+          <w:tcPr>
+            <w:tcW w:type="dxa" w:w="1276"/>
+          </w:tcPr>
+          <w:p>
+            <w:pPr>
+              <w:spacing w:after="0" w:before="0"/>
+              <w:jc w:val="left"/>
+            </w:pPr>
+            <w:r/>
+            <w:r>
+              <w:rPr>
+                <w:rFonts w:ascii="Times New Roman" w:hAnsi="Times New Roman"/>
+                <w:b w:val="0"/>
+                <w:sz w:val="16"/>
+              </w:rPr>
+              <w:t>No, acknowledged as a limitation</w:t>
+            </w:r>
+          </w:p>
+        </w:tc>
+        <w:tc>
+          <w:tcPr>
+            <w:tcW w:type="dxa" w:w="1021"/>
+          </w:tcPr>
+          <w:p>
+            <w:pPr>
+              <w:spacing w:after="0" w:before="0"/>
+              <w:jc w:val="left"/>
+            </w:pPr>
+            <w:r/>
+            <w:r>
+              <w:rPr>
+                <w:rFonts w:ascii="Times New Roman" w:hAnsi="Times New Roman"/>
+                <w:b w:val="0"/>
+                <w:sz w:val="16"/>
+              </w:rPr>
+              <w:t>No, and no cross-validation</w:t>
+            </w:r>
+          </w:p>
+        </w:tc>
+      </w:tr>
+      <w:tr>
+        <w:tc>
+          <w:tcPr>
+            <w:tcW w:type="dxa" w:w="1106"/>
+          </w:tcPr>
+          <w:p>
+            <w:pPr>
+              <w:spacing w:after="0" w:before="0"/>
+              <w:jc w:val="left"/>
+            </w:pPr>
+            <w:r/>
+            <w:r>
+              <w:rPr>
+                <w:rFonts w:ascii="Times New Roman" w:hAnsi="Times New Roman"/>
+                <w:b w:val="0"/>
+                <w:sz w:val="16"/>
+              </w:rPr>
+              <w:t>Elhadidy et al. (2025) [8]</w:t>
+            </w:r>
+          </w:p>
+        </w:tc>
+        <w:tc>
+          <w:tcPr>
+            <w:tcW w:type="dxa" w:w="1447"/>
+          </w:tcPr>
+          <w:p>
+            <w:pPr>
+              <w:spacing w:after="0" w:before="0"/>
+              <w:jc w:val="left"/>
+            </w:pPr>
+            <w:r/>
+            <w:r>
+              <w:rPr>
+                <w:rFonts w:ascii="Times New Roman" w:hAnsi="Times New Roman"/>
+                <w:b w:val="0"/>
+                <w:sz w:val="16"/>
+              </w:rPr>
+              <w:t>Four-class; Kaggle collection, augmented to 9,749 images</w:t>
+            </w:r>
+          </w:p>
+        </w:tc>
+        <w:tc>
+          <w:tcPr>
+            <w:tcW w:type="dxa" w:w="1191"/>
+          </w:tcPr>
+          <w:p>
+            <w:pPr>
+              <w:spacing w:after="0" w:before="0"/>
+              <w:jc w:val="left"/>
+            </w:pPr>
+            <w:r/>
+            <w:r>
+              <w:rPr>
+                <w:rFonts w:ascii="Times New Roman" w:hAnsi="Times New Roman"/>
+                <w:b w:val="0"/>
+                <w:sz w:val="16"/>
+              </w:rPr>
+              <w:t>98.72% test accuracy</w:t>
+            </w:r>
+          </w:p>
+        </w:tc>
+        <w:tc>
+          <w:tcPr>
+            <w:tcW w:type="dxa" w:w="1106"/>
+          </w:tcPr>
+          <w:p>
+            <w:pPr>
+              <w:spacing w:after="0" w:before="0"/>
+              <w:jc w:val="left"/>
+            </w:pPr>
+            <w:r/>
+            <w:r>
+              <w:rPr>
+                <w:rFonts w:ascii="Times New Roman" w:hAnsi="Times New Roman"/>
+                <w:b w:val="0"/>
+                <w:sz w:val="16"/>
+              </w:rPr>
+              <w:t>Custom 80/20 with 5-fold cross-validation ᵍ</w:t>
+            </w:r>
+          </w:p>
+        </w:tc>
+        <w:tc>
+          <w:tcPr>
+            <w:tcW w:type="dxa" w:w="1021"/>
+          </w:tcPr>
+          <w:p>
+            <w:pPr>
+              <w:spacing w:after="0" w:before="0"/>
+              <w:jc w:val="left"/>
+            </w:pPr>
+            <w:r/>
+            <w:r>
+              <w:rPr>
+                <w:rFonts w:ascii="Times New Roman" w:hAnsi="Times New Roman"/>
+                <w:b w:val="0"/>
+                <w:sz w:val="16"/>
+              </w:rPr>
+              <w:t>No</w:t>
+            </w:r>
+          </w:p>
+        </w:tc>
+        <w:tc>
+          <w:tcPr>
+            <w:tcW w:type="dxa" w:w="1191"/>
+          </w:tcPr>
+          <w:p>
+            <w:pPr>
+              <w:spacing w:after="0" w:before="0"/>
+              <w:jc w:val="left"/>
+            </w:pPr>
+            <w:r/>
+            <w:r>
+              <w:rPr>
+                <w:rFonts w:ascii="Times New Roman" w:hAnsi="Times New Roman"/>
+                <w:b w:val="0"/>
+                <w:sz w:val="16"/>
+              </w:rPr>
+              <w:t>No</w:t>
+            </w:r>
+          </w:p>
+        </w:tc>
+        <w:tc>
+          <w:tcPr>
+            <w:tcW w:type="dxa" w:w="1276"/>
+          </w:tcPr>
+          <w:p>
+            <w:pPr>
+              <w:spacing w:after="0" w:before="0"/>
+              <w:jc w:val="left"/>
+            </w:pPr>
+            <w:r/>
+            <w:r>
+              <w:rPr>
+                <w:rFonts w:ascii="Times New Roman" w:hAnsi="Times New Roman"/>
+                <w:b w:val="0"/>
+                <w:sz w:val="16"/>
+              </w:rPr>
+              <w:t>No</w:t>
+            </w:r>
+          </w:p>
+        </w:tc>
+        <w:tc>
+          <w:tcPr>
+            <w:tcW w:type="dxa" w:w="1021"/>
+          </w:tcPr>
+          <w:p>
+            <w:pPr>
+              <w:spacing w:after="0" w:before="0"/>
+              <w:jc w:val="left"/>
+            </w:pPr>
+            <w:r/>
+            <w:r>
+              <w:rPr>
+                <w:rFonts w:ascii="Times New Roman" w:hAnsi="Times New Roman"/>
+                <w:b w:val="0"/>
+                <w:sz w:val="16"/>
+              </w:rPr>
+              <w:t>No; cross-validation only</w:t>
+            </w:r>
+          </w:p>
+        </w:tc>
+      </w:tr>
+      <w:tr>
+        <w:tc>
+          <w:tcPr>
+            <w:tcW w:type="dxa" w:w="1106"/>
+            <w:shd w:val="clear" w:fill="F2F2F2"/>
+          </w:tcPr>
+          <w:p>
+            <w:pPr>
+              <w:spacing w:after="0" w:before="0"/>
+              <w:jc w:val="left"/>
+            </w:pPr>
+            <w:r/>
+            <w:r>
+              <w:rPr>
+                <w:rFonts w:ascii="Times New Roman" w:hAnsi="Times New Roman"/>
+                <w:b/>
+                <w:sz w:val="16"/>
+              </w:rPr>
+              <w:t>This study</w:t>
+            </w:r>
+          </w:p>
+        </w:tc>
+        <w:tc>
+          <w:tcPr>
+            <w:tcW w:type="dxa" w:w="1447"/>
+            <w:shd w:val="clear" w:fill="F2F2F2"/>
+          </w:tcPr>
+          <w:p>
+            <w:pPr>
+              <w:spacing w:after="0" w:before="0"/>
+              <w:jc w:val="left"/>
+            </w:pPr>
+            <w:r/>
+            <w:r>
+              <w:rPr>
+                <w:rFonts w:ascii="Times New Roman" w:hAnsi="Times New Roman"/>
+                <w:b/>
+                <w:sz w:val="16"/>
+              </w:rPr>
+              <w:t>Four-class internal; two glioma-focused shifted-domain probes</w:t>
+            </w:r>
+          </w:p>
+        </w:tc>
+        <w:tc>
+          <w:tcPr>
+            <w:tcW w:type="dxa" w:w="1191"/>
+            <w:shd w:val="clear" w:fill="F2F2F2"/>
+          </w:tcPr>
+          <w:p>
+            <w:pPr>
+              <w:spacing w:after="0" w:before="0"/>
+              <w:jc w:val="left"/>
+            </w:pPr>
+            <w:r/>
+            <w:r>
+              <w:rPr>
+                <w:rFonts w:ascii="Times New Roman" w:hAnsi="Times New Roman"/>
+                <w:b/>
+                <w:sz w:val="16"/>
+              </w:rPr>
+              <w:t>0.9673 ± 0.0043 test macro-F1 (best architecture mean)</w:t>
+            </w:r>
+          </w:p>
+        </w:tc>
+        <w:tc>
+          <w:tcPr>
+            <w:tcW w:type="dxa" w:w="1106"/>
+            <w:shd w:val="clear" w:fill="F2F2F2"/>
+          </w:tcPr>
+          <w:p>
+            <w:pPr>
+              <w:spacing w:after="0" w:before="0"/>
+              <w:jc w:val="left"/>
+            </w:pPr>
+            <w:r/>
+            <w:r>
+              <w:rPr>
+                <w:rFonts w:ascii="Times New Roman" w:hAnsi="Times New Roman"/>
+                <w:b/>
+                <w:sz w:val="16"/>
+              </w:rPr>
+              <w:t>Leakage-aware, near-duplicate groups assigned whole</w:t>
+            </w:r>
+          </w:p>
+        </w:tc>
+        <w:tc>
+          <w:tcPr>
+            <w:tcW w:type="dxa" w:w="1021"/>
+            <w:shd w:val="clear" w:fill="F2F2F2"/>
+          </w:tcPr>
+          <w:p>
+            <w:pPr>
+              <w:spacing w:after="0" w:before="0"/>
+              <w:jc w:val="left"/>
+            </w:pPr>
+            <w:r/>
+            <w:r>
+              <w:rPr>
+                <w:rFonts w:ascii="Times New Roman" w:hAnsi="Times New Roman"/>
+                <w:b/>
+                <w:sz w:val="16"/>
+              </w:rPr>
+              <w:t>Yes: ECE, NLL, Brier, confidence gap, before and after temperature scaling</w:t>
+            </w:r>
+          </w:p>
+        </w:tc>
+        <w:tc>
+          <w:tcPr>
+            <w:tcW w:type="dxa" w:w="1191"/>
+            <w:shd w:val="clear" w:fill="F2F2F2"/>
+          </w:tcPr>
+          <w:p>
+            <w:pPr>
+              <w:spacing w:after="0" w:before="0"/>
+              <w:jc w:val="left"/>
+            </w:pPr>
+            <w:r/>
+            <w:r>
+              <w:rPr>
+                <w:rFonts w:ascii="Times New Roman" w:hAnsi="Times New Roman"/>
+                <w:b/>
+                <w:sz w:val="16"/>
+              </w:rPr>
+              <w:t>Yes: exact and perceptual audit of every candidate; one rejected</w:t>
+            </w:r>
+          </w:p>
+        </w:tc>
+        <w:tc>
+          <w:tcPr>
+            <w:tcW w:type="dxa" w:w="1276"/>
+            <w:shd w:val="clear" w:fill="F2F2F2"/>
+          </w:tcPr>
+          <w:p>
+            <w:pPr>
+              <w:spacing w:after="0" w:before="0"/>
+              <w:jc w:val="left"/>
+            </w:pPr>
+            <w:r/>
+            <w:r>
+              <w:rPr>
+                <w:rFonts w:ascii="Times New Roman" w:hAnsi="Times New Roman"/>
+                <w:b/>
+                <w:sz w:val="16"/>
+              </w:rPr>
+              <w:t>Shifted-domain only, reported as behaviour rather than accuracy</w:t>
+            </w:r>
+          </w:p>
+        </w:tc>
+        <w:tc>
+          <w:tcPr>
+            <w:tcW w:type="dxa" w:w="1021"/>
+            <w:shd w:val="clear" w:fill="F2F2F2"/>
+          </w:tcPr>
+          <w:p>
+            <w:pPr>
+              <w:spacing w:after="0" w:before="0"/>
+              <w:jc w:val="left"/>
+            </w:pPr>
+            <w:r/>
+            <w:r>
+              <w:rPr>
+                <w:rFonts w:ascii="Times New Roman" w:hAnsi="Times New Roman"/>
+                <w:b/>
+                <w:sz w:val="16"/>
+              </w:rPr>
+              <w:t>Yes: five seeds per architecture, all values reported as mean ± SD</w:t>
+            </w:r>
+          </w:p>
+        </w:tc>
+      </w:tr>
+    </w:tbl>
+    <w:p>
+      <w:pPr>
+        <w:spacing w:after="160" w:before="120"/>
+        <w:jc w:val="left"/>
+      </w:pPr>
+      <w:r/>
+      <w:r>
+        <w:rPr>
+          <w:rFonts w:ascii="Times New Roman" w:hAnsi="Times New Roman"/>
+          <w:i/>
+          <w:sz w:val="16"/>
+        </w:rPr>
+        <w:t>Table 1. Reliability dimensions reported by representative high-performing brain MRI tumour classification studies. Every cell was determined from the full text of the cited paper; the supporting evidence is recorded in the supplementary material. Internal performance is reported by every study, whereas calibration analysis, leakage or overlap auditing, independent external validation and repeated training runs are almost entirely absent. ᵃ Binary task on the validation split, not a multi-class test set, and therefore not directly comparable with the other rows. ᵇ Patient identifiers are present in the source collection and were not used; slices from one patient may fall on both sides of the split. ᶜ Validation was performed on a Kaggle collection subsequently documented as sharing more than 2,260 images with the training source [30]; the study makes no independence claim or check. ᵈ The overlap is quantified but the detection method is not described. ᵉ Five random initialisations were run and the highest accuracy reported, which biases the headline figure upward relative to a single run. ᶠ The value of 98.73% reported in the source is a sample-weighted average over training and test partitions (support 7,023) rather than a test metric; the test accuracy is given here. ᵍ Augmentation appears to precede the split, so augmented copies of one source image may fall on both sides. A sixth study meeting the inclusion criteria was omitted: its reported figures are numerically identical to those of Zulfiqar et al. on the same dataset and pipeline, and the relationship between the two reports is unresolved.</w:t>
       </w:r>
     </w:p>
     <w:p>

</xml_diff>